<commit_message>
Regulatory package v1.0.1 rendered from commit 8d0ebc6 (clean tree): M&S report, anticipated FDA questions, SAP text proposals, appendix tables, traceability (656 values), SHA-256 manifest (262 files), reviewer README and release notes
Co-Authored-By: Claude Opus 5.5 <noreply@anthropic.com>
Claude-Session: https://claude.ai/code/session_01VcVRPzFxTqkW2KRC1Wkk1r
</commit_message>
<xml_diff>
--- a/regulatory/FDA_questions.docx
+++ b/regulatory/FDA_questions.docx
@@ -226,7 +226,7 @@
         <w:t xml:space="preserve"> </w:t>
       </w:r>
       <w:r>
-        <w:t xml:space="preserve">ed9e8ba4f2961b345d77f0dd32788d740cbd2763.</w:t>
+        <w:t xml:space="preserve">8d0ebc6b88e7f378b65f3fdc6c74c8ea98708e21.</w:t>
       </w:r>
     </w:p>
     <w:p>
@@ -248,7 +248,7 @@
         <w:t xml:space="preserve"> </w:t>
       </w:r>
       <w:r>
-        <w:t xml:space="preserve">0.9 (draft for sponsor review).</w:t>
+        <w:t xml:space="preserve">1.0.1 (draft for sponsor review).</w:t>
       </w:r>
     </w:p>
     <w:p>
@@ -375,7 +375,7 @@
         <w:t xml:space="preserve"> </w:t>
       </w:r>
       <w:r>
-        <w:t xml:space="preserve">It fails standard reliability criteria in 13.4% of subjects in the primary model.</w:t>
+        <w:t xml:space="preserve">In the trial population it fails the reliability criteria in 8.2% to 13.4% of subjects with an adjusted R-squared of at least 0.80 (criteria set (i), the lower end of the conventional range) and in 33.2% to 38.8% with at least 0.90 (set (iii)), two models (Q19, Q20).</w:t>
       </w:r>
     </w:p>
     <w:p>
@@ -415,7 +415,7 @@
         <w:t xml:space="preserve"> </w:t>
       </w:r>
       <w:r>
-        <w:t xml:space="preserve">AUC0-last + Cmax is at or below 5% in all 16 boundary scenarios: 15 conservative, 1 nominal, 0 exceeding.</w:t>
+        <w:t xml:space="preserve">With the pooled t-test (M0), AUC0-last + Cmax is 15 conservative, 1 nominal and 0 exceeding of 16 boundary scenarios; with the weight stratum in the model (M1), 15, 0 and 1 (Q7, Q17).</w:t>
       </w:r>
     </w:p>
     <w:p>
@@ -567,7 +567,7 @@
         <w:pStyle w:val="Compact"/>
       </w:pPr>
       <w:r>
-        <w:t xml:space="preserve">In 15 of the 16 scenarios the bias points away from 1, which makes the test conservative (report Table 5-6).</w:t>
+        <w:t xml:space="preserve">In 15 of the 16 scenarios the bias points away from 1, which makes the test conservative (report Table 5-10).</w:t>
       </w:r>
     </w:p>
     <w:bookmarkEnd w:id="21"/>
@@ -1007,7 +1007,7 @@
         <w:t xml:space="preserve"> </w:t>
       </w:r>
       <w:r>
-        <w:t xml:space="preserve">All 16 boundary cells are at or below the nominal level; one point estimate slightly exceeds 5%, but its interval includes 5% and the mechanism is not plausible for a biosimilar.</w:t>
+        <w:t xml:space="preserve">With the pooled t-test (M0), 15 of 16 boundary cells are conservative, 1 nominal and 0 exceeding. With the weight stratum in the model (M1), they are 15, 0 and 1. The highest cell is the same under both analysis models, the 2020-model cell with peripheral volume up (multiplier 2.28): 5.18% (95% CI 4.88 to 5.50) under M0 and 5.63% (95% CI 5.31 to 5.95) under M1.</w:t>
       </w:r>
     </w:p>
     <w:p>
@@ -1019,13 +1019,13 @@
           <w:bCs/>
           <w:b/>
         </w:rPr>
-        <w:t xml:space="preserve">Overall result.</w:t>
-      </w:r>
-      <w:r>
-        <w:t xml:space="preserve"> </w:t>
-      </w:r>
-      <w:r>
-        <w:t xml:space="preserve">15 of 16 boundary cells are conservative and 1 is nominal.</w:t>
+        <w:t xml:space="preserve">Overall result</w:t>
+      </w:r>
+      <w:r>
+        <w:t xml:space="preserve"> </w:t>
+      </w:r>
+      <w:r>
+        <w:t xml:space="preserve">(report Sections 5.4 and 5.9):</w:t>
       </w:r>
     </w:p>
     <w:p>
@@ -1037,7 +1037,7 @@
         <w:pStyle w:val="Compact"/>
       </w:pPr>
       <w:r>
-        <w:t xml:space="preserve">Primary model maximum: 3.97% (95% CI 3.60 to 4.37).</w:t>
+        <w:t xml:space="preserve">M0: 0.00% to 5.18%; primary model maximum 3.97% (95% CI 3.60 to 4.37), 2020 model maximum 5.18% (95% CI 4.88 to 5.50).</w:t>
       </w:r>
     </w:p>
     <w:p>
@@ -1049,7 +1049,7 @@
         <w:pStyle w:val="Compact"/>
       </w:pPr>
       <w:r>
-        <w:t xml:space="preserve">2020 model maximum: 5.18% (95% CI 4.88 to 5.50), reached when the peripheral volume increases 2.28-fold (3.21-fold in the primary model).</w:t>
+        <w:t xml:space="preserve">M1: 0.00% to 5.63%.</w:t>
       </w:r>
     </w:p>
     <w:p>
@@ -1061,13 +1061,13 @@
           <w:bCs/>
           <w:b/>
         </w:rPr>
-        <w:t xml:space="preserve">Why that cell is slightly above 5%</w:t>
-      </w:r>
-      <w:r>
-        <w:t xml:space="preserve"> </w:t>
-      </w:r>
-      <w:r>
-        <w:t xml:space="preserve">(report Sections 5.4 and 6.2):</w:t>
+        <w:t xml:space="preserve">The highest cell</w:t>
+      </w:r>
+      <w:r>
+        <w:t xml:space="preserve"> </w:t>
+      </w:r>
+      <w:r>
+        <w:t xml:space="preserve">(2020 model, peripheral volume x2.28; x3.21 in the primary model for the same true ratio):</w:t>
       </w:r>
     </w:p>
     <w:p>
@@ -1079,7 +1079,7 @@
         <w:pStyle w:val="Compact"/>
       </w:pPr>
       <w:r>
-        <w:t xml:space="preserve">The Wilson interval includes 5%, so the cell is classified as nominal.</w:t>
+        <w:t xml:space="preserve">M0: 5.18% (95% CI 4.88 to 5.50) (20,000 trials), nominal; at the pre-specified 10,000 trials the value was 5.32% (95% CI 4.90 to 5.78).</w:t>
       </w:r>
     </w:p>
     <w:p>
@@ -1091,7 +1091,7 @@
         <w:pStyle w:val="Compact"/>
       </w:pPr>
       <w:r>
-        <w:t xml:space="preserve">At the pre-specified 10,000 trials the value was 5.32% (95% CI 4.90 to 5.78).</w:t>
+        <w:t xml:space="preserve">M1: 5.63% (95% CI 5.31 to 5.95) (20,000 trials), exceeding. M2: 5.75% (95% CI 5.43 to 6.08), exceeding.</w:t>
       </w:r>
     </w:p>
     <w:p>
@@ -1103,25 +1103,19 @@
         <w:pStyle w:val="Compact"/>
       </w:pPr>
       <w:r>
-        <w:t xml:space="preserve">The small excess is explained by a bias of AUC0-last toward 1 of 0.41% in that mechanism.</w:t>
-      </w:r>
-    </w:p>
-    <w:p>
-      <w:pPr>
-        <w:pStyle w:val="FirstParagraph"/>
-      </w:pPr>
-      <w:r>
-        <w:rPr>
-          <w:bCs/>
-          <w:b/>
-        </w:rPr>
-        <w:t xml:space="preserve">Why the mechanism is implausible.</w:t>
-      </w:r>
-      <w:r>
-        <w:t xml:space="preserve"> </w:t>
-      </w:r>
-      <w:r>
-        <w:t xml:space="preserve">A two- to three-fold difference in peripheral distribution volume is not expected for a product with the same amino-acid sequence.</w:t>
+        <w:t xml:space="preserve">Cause (M1): the AUC0-last GMR is biased by 0.41% relative to the true AUC0-inf ratio, toward 1. This moves the pass rate from 4.94% for the unbiased reference to 5.65% for AUC0-last alone; Cmax failures change it by -0.02 percentage points.</w:t>
+      </w:r>
+    </w:p>
+    <w:p>
+      <w:pPr>
+        <w:numPr>
+          <w:ilvl w:val="0"/>
+          <w:numId w:val="1011"/>
+        </w:numPr>
+        <w:pStyle w:val="Compact"/>
+      </w:pPr>
+      <w:r>
+        <w:t xml:space="preserve">Facts relevant to plausibility: a proposed biosimilar has the same amino-acid sequence as the reference IgG4 antibody; this cell requires its peripheral volume of distribution to be 2.28 times (2020 model) or 3.21 times (primary model) that of the reference, with absorption and clearance unchanged.</w:t>
       </w:r>
     </w:p>
     <w:bookmarkEnd w:id="26"/>
@@ -1149,7 +1143,7 @@
         <w:t xml:space="preserve"> </w:t>
       </w:r>
       <w:r>
-        <w:t xml:space="preserve">NCA AUC0-inf is not the true AUC0-inf. Two biases push the test and reference ratio toward 1 (report Section 5.4, Table 5-7).</w:t>
+        <w:t xml:space="preserve">NCA AUC0-inf is not the true AUC0-inf. Two biases push the test and reference ratio toward 1 (report Section 5.4, Table 5-11).</w:t>
       </w:r>
     </w:p>
     <w:p>
@@ -1287,7 +1281,7 @@
         <w:t xml:space="preserve"> </w:t>
       </w:r>
       <w:r>
-        <w:t xml:space="preserve">Including all subjects with a lambda-z still inflates the type I error; substituting AUC0-last controls it but is no longer a pure AUC0-inf analysis.</w:t>
+        <w:t xml:space="preserve">Including all subjects with a lambda-z still inflates the type I error; substituting AUC0-last gives a type I error close to that of AUC0-last + Cmax, because the substituted endpoint is mostly AUC0-last, but it is no longer a pure AUC0-inf analysis.</w:t>
       </w:r>
     </w:p>
     <w:p>
@@ -1331,7 +1325,7 @@
         <w:t xml:space="preserve"> </w:t>
       </w:r>
       <w:r>
-        <w:t xml:space="preserve">Controls the type I error: largest 5.01% (95% CI 4.71 to 5.32) with the span criterion and 4.63% (95% CI 4.34 to 4.92) without it.</w:t>
+        <w:t xml:space="preserve">Close to AUC0-last + Cmax: largest 5.01% (95% CI 4.71 to 5.32) with the span criterion and 4.63% (95% CI 4.34 to 4.92) without it (pooled t-test); 5.39% (95% CI 5.09 to 5.71) with the span criterion under the ANOVA with the weight stratum, in the same peripheral-volume scenario in which AUC0-last + Cmax is highest.</w:t>
       </w:r>
     </w:p>
     <w:p>
@@ -1495,7 +1489,7 @@
         <w:pStyle w:val="Compact"/>
       </w:pPr>
       <w:r>
-        <w:t xml:space="preserve">reliability criteria of adjusted R-squared at least 0.80 and extrapolation at most 20% (no span-ratio criterion).</w:t>
+        <w:t xml:space="preserve">reliability criteria of adjusted R-squared at least 0.80 and extrapolation at most 20% (criteria set (i)) as the primary definition, with adjusted R-squared at least 0.90 (set (iii)) reported alongside, because both are conventional and neither is a software default (Q19); no span-ratio criterion.</w:t>
       </w:r>
     </w:p>
     <w:p>
@@ -1591,7 +1585,7 @@
         <w:t xml:space="preserve"> </w:t>
       </w:r>
       <w:r>
-        <w:t xml:space="preserve">Yes. Simulated power is about 99% for identical products.</w:t>
+        <w:t xml:space="preserve">At the protocol CV of 43% and a true GMR of 0.95, 117 evaluable subjects per arm give P2 power of 94.0% (M0) and 94.5% (M1). At a CV of 50%, power falls to 87.2% and 88.0%.</w:t>
       </w:r>
     </w:p>
     <w:p>
@@ -1615,7 +1609,7 @@
         <w:pStyle w:val="Compact"/>
       </w:pPr>
       <w:r>
-        <w:t xml:space="preserve">The simulated log-scale CV of AUC0-last is 40% (primary model) and 43% (2020 model).</w:t>
+        <w:t xml:space="preserve">The simulated log-scale CV of AUC0-last is 40% (primary model) and 43% (2020 model); the protocol assumes 43%.</w:t>
       </w:r>
     </w:p>
     <w:p>
@@ -1627,19 +1621,7 @@
         <w:pStyle w:val="Compact"/>
       </w:pPr>
       <w:r>
-        <w:t xml:space="preserve">The sample-size assumption is 43%.</w:t>
-      </w:r>
-    </w:p>
-    <w:p>
-      <w:pPr>
-        <w:numPr>
-          <w:ilvl w:val="0"/>
-          <w:numId w:val="1018"/>
-        </w:numPr>
-        <w:pStyle w:val="Compact"/>
-      </w:pPr>
-      <w:r>
-        <w:t xml:space="preserve">The AUC0-last CI reported for a 200 mg device comparison implies about 52%. That was a different presentation and a heavier population, with a possible device effect.</w:t>
+        <w:t xml:space="preserve">Li 2020 (Table 3, 300 mg arms) reports SD/mean of 35% to 51%. The AUC0-last CI of a 200 mg device comparison implies about 52% (Cohen 2022; different presentation, heavier population, possible device effect).</w:t>
       </w:r>
     </w:p>
     <w:p>
@@ -1651,13 +1633,55 @@
           <w:bCs/>
           <w:b/>
         </w:rPr>
-        <w:t xml:space="preserve">Power at 117 evaluable subjects per arm, identical products:</w:t>
-      </w:r>
-      <w:r>
-        <w:t xml:space="preserve"> </w:t>
-      </w:r>
-      <w:r>
-        <w:t xml:space="preserve">99.6% (95% CI 99.4 to 99.7) (primary model) and 99.0% (95% CI 98.8 to 99.2) (2020 model).</w:t>
+        <w:t xml:space="preserve">Evaluable subjects per arm for P2 at GMR 0.95</w:t>
+      </w:r>
+      <w:r>
+        <w:t xml:space="preserve"> </w:t>
+      </w:r>
+      <w:r>
+        <w:t xml:space="preserve">(report Section 5.11; randomized per arm in parentheses, 117/130 evaluable):</w:t>
+      </w:r>
+    </w:p>
+    <w:p>
+      <w:pPr>
+        <w:numPr>
+          <w:ilvl w:val="0"/>
+          <w:numId w:val="1019"/>
+        </w:numPr>
+        <w:pStyle w:val="Compact"/>
+      </w:pPr>
+      <w:r>
+        <w:t xml:space="preserve">90% power: CV 43% 100 (112) with M0, 97 (108) with M1; CV 50% 129 (144) and 126 (140).</w:t>
+      </w:r>
+    </w:p>
+    <w:p>
+      <w:pPr>
+        <w:numPr>
+          <w:ilvl w:val="0"/>
+          <w:numId w:val="1019"/>
+        </w:numPr>
+        <w:pStyle w:val="Compact"/>
+      </w:pPr>
+      <w:r>
+        <w:t xml:space="preserve">85% power: CV 43% 85 and 83; CV 50% 110 and 107.</w:t>
+      </w:r>
+    </w:p>
+    <w:p>
+      <w:pPr>
+        <w:pStyle w:val="FirstParagraph"/>
+      </w:pPr>
+      <w:r>
+        <w:rPr>
+          <w:bCs/>
+          <w:b/>
+        </w:rPr>
+        <w:t xml:space="preserve">Identical products,</w:t>
+      </w:r>
+      <w:r>
+        <w:t xml:space="preserve"> </w:t>
+      </w:r>
+      <w:r>
+        <w:t xml:space="preserve">PK-model trials with 117 per arm: 99.6% (95% CI 99.4 to 99.7) (primary model) and 99.0% (95% CI 98.8 to 99.2) (2020 model) with M0.</w:t>
       </w:r>
     </w:p>
     <w:p>
@@ -1669,13 +1693,7 @@
           <w:bCs/>
           <w:b/>
         </w:rPr>
-        <w:t xml:space="preserve">If the Cohen-like variability applied</w:t>
-      </w:r>
-      <w:r>
-        <w:t xml:space="preserve"> </w:t>
-      </w:r>
-      <w:r>
-        <w:t xml:space="preserve">(a sponsor decision), the sample size should be re-checked.</w:t>
+        <w:t xml:space="preserve">The target power and the sample size are sponsor decisions.</w:t>
       </w:r>
     </w:p>
     <w:bookmarkEnd w:id="31"/>
@@ -1743,7 +1761,7 @@
       <w:pPr>
         <w:numPr>
           <w:ilvl w:val="0"/>
-          <w:numId w:val="1019"/>
+          <w:numId w:val="1020"/>
         </w:numPr>
         <w:pStyle w:val="Compact"/>
       </w:pPr>
@@ -1755,7 +1773,7 @@
       <w:pPr>
         <w:numPr>
           <w:ilvl w:val="0"/>
-          <w:numId w:val="1019"/>
+          <w:numId w:val="1020"/>
         </w:numPr>
         <w:pStyle w:val="Compact"/>
       </w:pPr>
@@ -1767,7 +1785,7 @@
       <w:pPr>
         <w:numPr>
           <w:ilvl w:val="0"/>
-          <w:numId w:val="1019"/>
+          <w:numId w:val="1020"/>
         </w:numPr>
         <w:pStyle w:val="Compact"/>
       </w:pPr>
@@ -1779,7 +1797,7 @@
       <w:pPr>
         <w:numPr>
           <w:ilvl w:val="0"/>
-          <w:numId w:val="1019"/>
+          <w:numId w:val="1020"/>
         </w:numPr>
         <w:pStyle w:val="Compact"/>
       </w:pPr>
@@ -1791,7 +1809,7 @@
       <w:pPr>
         <w:numPr>
           <w:ilvl w:val="0"/>
-          <w:numId w:val="1019"/>
+          <w:numId w:val="1020"/>
         </w:numPr>
         <w:pStyle w:val="Compact"/>
       </w:pPr>
@@ -1802,6 +1820,24 @@
     <w:p>
       <w:pPr>
         <w:pStyle w:val="FirstParagraph"/>
+      </w:pPr>
+      <w:r>
+        <w:rPr>
+          <w:bCs/>
+          <w:b/>
+        </w:rPr>
+        <w:t xml:space="preserve">Version 1.0.1.</w:t>
+      </w:r>
+      <w:r>
+        <w:t xml:space="preserve"> </w:t>
+      </w:r>
+      <w:r>
+        <w:t xml:space="preserve">The analysis models with the weight stratum or log body weight, the LLOQ sensitivity, the sample-size grid, criteria sets (iii) and (iv) and the trial-population analyses were registered in config/prereg_20260926.yaml and committed before they were run (report Sections 3.12 and 3.13). Results seen before each registration are disclosed in report Appendix D.</w:t>
+      </w:r>
+    </w:p>
+    <w:p>
+      <w:pPr>
+        <w:pStyle w:val="BodyText"/>
       </w:pPr>
       <w:r>
         <w:rPr>
@@ -1849,7 +1885,7 @@
       <w:pPr>
         <w:numPr>
           <w:ilvl w:val="0"/>
-          <w:numId w:val="1020"/>
+          <w:numId w:val="1021"/>
         </w:numPr>
         <w:pStyle w:val="Compact"/>
       </w:pPr>
@@ -1861,7 +1897,7 @@
       <w:pPr>
         <w:numPr>
           <w:ilvl w:val="0"/>
-          <w:numId w:val="1020"/>
+          <w:numId w:val="1021"/>
         </w:numPr>
         <w:pStyle w:val="Compact"/>
       </w:pPr>
@@ -1873,7 +1909,7 @@
       <w:pPr>
         <w:numPr>
           <w:ilvl w:val="0"/>
-          <w:numId w:val="1020"/>
+          <w:numId w:val="1021"/>
         </w:numPr>
         <w:pStyle w:val="Compact"/>
       </w:pPr>
@@ -1897,7 +1933,7 @@
       <w:pPr>
         <w:numPr>
           <w:ilvl w:val="0"/>
-          <w:numId w:val="1021"/>
+          <w:numId w:val="1022"/>
         </w:numPr>
         <w:pStyle w:val="Compact"/>
       </w:pPr>
@@ -1909,7 +1945,7 @@
       <w:pPr>
         <w:numPr>
           <w:ilvl w:val="0"/>
-          <w:numId w:val="1021"/>
+          <w:numId w:val="1022"/>
         </w:numPr>
         <w:pStyle w:val="Compact"/>
       </w:pPr>
@@ -1921,7 +1957,7 @@
       <w:pPr>
         <w:numPr>
           <w:ilvl w:val="0"/>
-          <w:numId w:val="1021"/>
+          <w:numId w:val="1022"/>
         </w:numPr>
         <w:pStyle w:val="Compact"/>
       </w:pPr>
@@ -1979,7 +2015,7 @@
       <w:pPr>
         <w:numPr>
           <w:ilvl w:val="0"/>
-          <w:numId w:val="1022"/>
+          <w:numId w:val="1023"/>
         </w:numPr>
         <w:pStyle w:val="Compact"/>
       </w:pPr>
@@ -1991,7 +2027,7 @@
       <w:pPr>
         <w:numPr>
           <w:ilvl w:val="0"/>
-          <w:numId w:val="1022"/>
+          <w:numId w:val="1023"/>
         </w:numPr>
         <w:pStyle w:val="Compact"/>
       </w:pPr>
@@ -2042,7 +2078,7 @@
         <w:t xml:space="preserve"> </w:t>
       </w:r>
       <w:r>
-        <w:t xml:space="preserve">Coverage by AUC0-last holds across 40 to 150 kg, but the reliability of AUC0-inf declines with weight.</w:t>
+        <w:t xml:space="preserve">The endpoint proposal is judged in the trial population (healthy adults of 60 to 90 kg), where the heavier randomization stratum already fails the reliability criteria more often (Q20). Results for heavier subjects outside the study range are robustness checks (report Appendix I), not evidence for the proposal.</w:t>
       </w:r>
     </w:p>
     <w:p>
@@ -2054,37 +2090,141 @@
           <w:bCs/>
           <w:b/>
         </w:rPr>
+        <w:t xml:space="preserve">Robustness check</w:t>
+      </w:r>
+      <w:r>
+        <w:t xml:space="preserve"> </w:t>
+      </w:r>
+      <w:r>
+        <w:t xml:space="preserve">(report Appendix I; uniform weight bands of 20,000 subjects each, primary model):</w:t>
+      </w:r>
+    </w:p>
+    <w:p>
+      <w:pPr>
+        <w:numPr>
+          <w:ilvl w:val="0"/>
+          <w:numId w:val="1024"/>
+        </w:numPr>
+        <w:pStyle w:val="Compact"/>
+      </w:pPr>
+      <w:r>
+        <w:t xml:space="preserve">The median true extrapolated fraction ranges from 0.51 to 1.40% across the bands.</w:t>
+      </w:r>
+    </w:p>
+    <w:p>
+      <w:pPr>
+        <w:numPr>
+          <w:ilvl w:val="0"/>
+          <w:numId w:val="1024"/>
+        </w:numPr>
+        <w:pStyle w:val="Compact"/>
+      </w:pPr>
+      <w:r>
+        <w:t xml:space="preserve">AUC0-inf reliability under criteria set (i) falls from 90.8% to 70.9% across the bands.</w:t>
+      </w:r>
+    </w:p>
+    <w:bookmarkEnd w:id="35"/>
+    <w:bookmarkStart w:id="36" w:name="X348e6410a186d79a80aedf91aa33cdf13a1fbbc"/>
+    <w:p>
+      <w:pPr>
+        <w:pStyle w:val="Heading2"/>
+      </w:pPr>
+      <w:r>
+        <w:t xml:space="preserve">Q17. The randomization is stratified by body weight. Why is the stratum not in the analysis model?</w:t>
+      </w:r>
+    </w:p>
+    <w:p>
+      <w:pPr>
+        <w:pStyle w:val="FirstParagraph"/>
+      </w:pPr>
+      <w:r>
+        <w:rPr>
+          <w:bCs/>
+          <w:b/>
+        </w:rPr>
+        <w:t xml:space="preserve">Short answer.</w:t>
+      </w:r>
+      <w:r>
+        <w:t xml:space="preserve"> </w:t>
+      </w:r>
+      <w:r>
+        <w:t xml:space="preserve">Both analyses were evaluated on the same simulated trials, and the choice is left to the sponsor’s SAP. ICH E9 (section 5.7) states that factors used to stratify the randomization should be accounted for in the analysis, and the FDA guidance on covariate adjustment (2023) states that an adjustment model should generally include the strata variables. Including the stratum (M1) makes the standard error match the sampling variability. On the same trials, this changes the boundary type I error of AUC0-last + Cmax by 0.00 to 0.45 percentage points (mean 0.30) and the power for identical products by 0.10 percentage points (primary model).</w:t>
+      </w:r>
+    </w:p>
+    <w:p>
+      <w:pPr>
+        <w:pStyle w:val="BodyText"/>
+      </w:pPr>
+      <w:r>
+        <w:rPr>
+          <w:bCs/>
+          <w:b/>
+        </w:rPr>
         <w:t xml:space="preserve">Evidence</w:t>
       </w:r>
       <w:r>
         <w:t xml:space="preserve"> </w:t>
       </w:r>
       <w:r>
-        <w:t xml:space="preserve">(report Sections 5.3 and 5.8; weight bands of 20,000 subjects each):</w:t>
-      </w:r>
-    </w:p>
-    <w:p>
-      <w:pPr>
-        <w:numPr>
-          <w:ilvl w:val="0"/>
-          <w:numId w:val="1023"/>
-        </w:numPr>
-        <w:pStyle w:val="Compact"/>
-      </w:pPr>
-      <w:r>
-        <w:t xml:space="preserve">The median true extrapolation ranges from 0.51 to 1.40%.</w:t>
-      </w:r>
-    </w:p>
-    <w:p>
-      <w:pPr>
-        <w:numPr>
-          <w:ilvl w:val="0"/>
-          <w:numId w:val="1023"/>
-        </w:numPr>
-        <w:pStyle w:val="Compact"/>
-      </w:pPr>
-      <w:r>
-        <w:t xml:space="preserve">AUC0-inf reliability falls from 90.8% to 70.9% across the bands.</w:t>
+        <w:t xml:space="preserve">(report Section 5.9):</w:t>
+      </w:r>
+    </w:p>
+    <w:p>
+      <w:pPr>
+        <w:numPr>
+          <w:ilvl w:val="0"/>
+          <w:numId w:val="1025"/>
+        </w:numPr>
+        <w:pStyle w:val="Compact"/>
+      </w:pPr>
+      <w:r>
+        <w:t xml:space="preserve">Between-trial SD of the log GMR divided by the median within-trial SE, unbiased reference: 0.961 to 0.993 (M0) and 0.991 to 1.020 (M1).</w:t>
+      </w:r>
+    </w:p>
+    <w:p>
+      <w:pPr>
+        <w:numPr>
+          <w:ilvl w:val="0"/>
+          <w:numId w:val="1025"/>
+        </w:numPr>
+        <w:pStyle w:val="Compact"/>
+      </w:pPr>
+      <w:r>
+        <w:t xml:space="preserve">AUC0-last + Cmax: M0 15 conservative, 1 nominal, 0 exceeding (0.00% to 5.18%); M1 15, 0, 1 (0.00% to 5.63%).</w:t>
+      </w:r>
+    </w:p>
+    <w:p>
+      <w:pPr>
+        <w:numPr>
+          <w:ilvl w:val="0"/>
+          <w:numId w:val="1025"/>
+        </w:numPr>
+        <w:pStyle w:val="Compact"/>
+      </w:pPr>
+      <w:r>
+        <w:t xml:space="preserve">Power, identical products: 99.6% (95% CI 99.4 to 99.7) (M0) and 99.7% (95% CI 99.5 to 99.7) (M1), primary model.</w:t>
+      </w:r>
+    </w:p>
+    <w:p>
+      <w:pPr>
+        <w:numPr>
+          <w:ilvl w:val="0"/>
+          <w:numId w:val="1025"/>
+        </w:numPr>
+        <w:pStyle w:val="Compact"/>
+      </w:pPr>
+      <w:r>
+        <w:t xml:space="preserve">Sample size at CV 43%, 90% power: 100 (M0) and 97 (M1) evaluable per arm. The stratum explains only a small part of the variance, so the gain in precision is small.</w:t>
+      </w:r>
+    </w:p>
+    <w:bookmarkEnd w:id="36"/>
+    <w:bookmarkStart w:id="37" w:name="X36f22387af7c1454c9818786489f1b7e4c9f630"/>
+    <w:p>
+      <w:pPr>
+        <w:pStyle w:val="Heading2"/>
+      </w:pPr>
+      <w:r>
+        <w:t xml:space="preserve">Q18. The LLOQ of the sponsor’s assay may differ from the originator’s. Do the conclusions depend on it?</w:t>
       </w:r>
     </w:p>
     <w:p>
@@ -2096,16 +2236,234 @@
           <w:bCs/>
           <w:b/>
         </w:rPr>
+        <w:t xml:space="preserve">Short answer.</w:t>
+      </w:r>
+      <w:r>
+        <w:t xml:space="preserve"> </w:t>
+      </w:r>
+      <w:r>
+        <w:t xml:space="preserve">Coverage of total exposure by AUC0-last and the boundary type I error of AUC0-last + Cmax change little between 0.02 and 0.5 mg/L. A lower LLOQ with the same assay noise makes AUC0-inf less reliable, not more. The LLOQ is set in one configuration file, and all results can be regenerated with the validated value.</w:t>
+      </w:r>
+    </w:p>
+    <w:p>
+      <w:pPr>
+        <w:pStyle w:val="BodyText"/>
+      </w:pPr>
+      <w:r>
+        <w:rPr>
+          <w:bCs/>
+          <w:b/>
+        </w:rPr>
+        <w:t xml:space="preserve">Evidence</w:t>
+      </w:r>
+      <w:r>
+        <w:t xml:space="preserve"> </w:t>
+      </w:r>
+      <w:r>
+        <w:t xml:space="preserve">(report Section 5.10; same subjects and residual draws re-censored at each LLOQ; simulations used 0.078 mg/L):</w:t>
+      </w:r>
+    </w:p>
+    <w:p>
+      <w:pPr>
+        <w:numPr>
+          <w:ilvl w:val="0"/>
+          <w:numId w:val="1026"/>
+        </w:numPr>
+        <w:pStyle w:val="Compact"/>
+      </w:pPr>
+      <w:r>
+        <w:t xml:space="preserve">Window coverage (true AUC0-tlast / true AUC0-inf) below 80%: 0.00% of subjects at 0.02 mg/L to 0.01% at 0.5 mg/L (primary model). The true concentration reaches 0.02 mg/L and 0.5 mg/L within about 38.6 and 37.7 study days (medians), inside the cliff.</w:t>
+      </w:r>
+    </w:p>
+    <w:p>
+      <w:pPr>
+        <w:numPr>
+          <w:ilvl w:val="0"/>
+          <w:numId w:val="1026"/>
+        </w:numPr>
+        <w:pStyle w:val="Compact"/>
+      </w:pPr>
+      <w:r>
+        <w:t xml:space="preserve">AUC0-inf reliability (criteria (i)): 84.2% at 0.02 mg/L, 86.6% at 0.078 mg/L and 88.0% at 0.5 mg/L with the residual error as estimated; 84.6% at 0.02 mg/L if the assay noise scales with the LLOQ.</w:t>
+      </w:r>
+    </w:p>
+    <w:p>
+      <w:pPr>
+        <w:numPr>
+          <w:ilvl w:val="0"/>
+          <w:numId w:val="1026"/>
+        </w:numPr>
+        <w:pStyle w:val="Compact"/>
+      </w:pPr>
+      <w:r>
+        <w:t xml:space="preserve">Boundary type I error of AUC0-last + Cmax over the six LLOQs (three boundary scenarios, primary model): 2.22% to 4.22% (M0) and 2.60% to 4.62% (M1).</w:t>
+      </w:r>
+    </w:p>
+    <w:bookmarkEnd w:id="37"/>
+    <w:bookmarkStart w:id="38" w:name="Xf015c3105edfe1a34bd164f0a080643222757b2"/>
+    <w:p>
+      <w:pPr>
+        <w:pStyle w:val="Heading2"/>
+      </w:pPr>
+      <w:r>
+        <w:t xml:space="preserve">Q19. Is an adjusted R-squared of at least 0.80 a Phoenix WinNonlin criterion?</w:t>
+      </w:r>
+    </w:p>
+    <w:p>
+      <w:pPr>
+        <w:pStyle w:val="FirstParagraph"/>
+      </w:pPr>
+      <w:r>
+        <w:rPr>
+          <w:bCs/>
+          <w:b/>
+        </w:rPr>
+        <w:t xml:space="preserve">Short answer.</w:t>
+      </w:r>
+      <w:r>
+        <w:t xml:space="preserve"> </w:t>
+      </w:r>
+      <w:r>
+        <w:t xml:space="preserve">No. Phoenix WinNonlin does not define reliability criteria for lambda-z. Its Lambda Z Acceptance Criteria (Rules tab) are optional entries in which the user sets a minimum adjusted R-squared, a maximum extrapolated percentage and a minimum span. Profiles that do not meet them are flagged (Accepted or Not_Accepted), not excluded, and no values are applied unless entered (Certara Phoenix 8.2 NCA documentation). A minimum of 0.80 is a statistical analysis plan convention; 0.90, sometimes with a span of at least 3 half-lives, is common in public statistical analysis plans: NCT04117607 (adjusted R-squared at least 0.90, span at least 3.0 half-lives, at least 3 points after tmax), NCT04441905 (adjusted R-squared at least 0.90, at least 3 points) and NCT04700163 (adjusted R-squared above 0.90, otherwise AUC0-inf and the other terminal parameters are excluded from summaries and statistical analysis; verified from a web-search excerpt). The analyses were therefore repeated for four criteria sets, and the share without a reliable AUC0-inf under 0.80 is the lower end of the conventional range.</w:t>
+      </w:r>
+    </w:p>
+    <w:p>
+      <w:pPr>
+        <w:pStyle w:val="BodyText"/>
+      </w:pPr>
+      <w:r>
+        <w:rPr>
+          <w:bCs/>
+          <w:b/>
+        </w:rPr>
+        <w:t xml:space="preserve">Evidence</w:t>
+      </w:r>
+      <w:r>
+        <w:t xml:space="preserve"> </w:t>
+      </w:r>
+      <w:r>
+        <w:t xml:space="preserve">(trial population; report Sections 3.4, 5.3 and 5.4; 20,000 subjects per model; 16 boundary scenarios):</w:t>
+      </w:r>
+    </w:p>
+    <w:p>
+      <w:pPr>
+        <w:numPr>
+          <w:ilvl w:val="0"/>
+          <w:numId w:val="1027"/>
+        </w:numPr>
+        <w:pStyle w:val="Compact"/>
+      </w:pPr>
+      <w:r>
+        <w:t xml:space="preserve">Subjects without a reliable AUC0-inf, trial population (healthy, 60 to 90 kg, two models): 8.2% to 13.4% with adjusted R-squared at least 0.80 (set (i)); 33.2% to 38.8% with at least 0.90 (set (iii)); 65.9% to 72.5% with at least 0.90 and a span of at least 3 (set (iv)).</w:t>
+      </w:r>
+    </w:p>
+    <w:p>
+      <w:pPr>
+        <w:numPr>
+          <w:ilvl w:val="0"/>
+          <w:numId w:val="1027"/>
+        </w:numPr>
+        <w:pStyle w:val="Compact"/>
+      </w:pPr>
+      <w:r>
+        <w:t xml:space="preserve">AUC0-inf + Cmax with rule A exceeds 5% in 8 (set (i)), 12 (set (ii)), 9 (set (iii)) and 12 (set (iv)) of 16 boundary scenarios (M0). With rule C the range is 0.00% to 4.63% (set (i)) and 0.00% to 5.21% (set (iii)).</w:t>
+      </w:r>
+    </w:p>
+    <w:p>
+      <w:pPr>
+        <w:numPr>
+          <w:ilvl w:val="0"/>
+          <w:numId w:val="1027"/>
+        </w:numPr>
+        <w:pStyle w:val="Compact"/>
+      </w:pPr>
+      <w:r>
+        <w:t xml:space="preserve">On the same trials, the AUC0-inf + Cmax decision changes between rules A, B and C in a median of 4.7% and up to 19.7% of trials with set (i) and a median of 6.2% and up to 20.7% with set (iii), and between criteria sets within rule A in a median of 11.4% and up to 37.5%.</w:t>
+      </w:r>
+    </w:p>
+    <w:p>
+      <w:pPr>
+        <w:pStyle w:val="FirstParagraph"/>
+      </w:pPr>
+      <w:r>
+        <w:rPr>
+          <w:bCs/>
+          <w:b/>
+        </w:rPr>
         <w:t xml:space="preserve">Implication.</w:t>
       </w:r>
       <w:r>
         <w:t xml:space="preserve"> </w:t>
       </w:r>
       <w:r>
-        <w:t xml:space="preserve">An analysis restricted to reliable subjects would under-represent heavier subjects.</w:t>
-      </w:r>
-    </w:p>
-    <w:bookmarkEnd w:id="35"/>
+        <w:t xml:space="preserve">The sponsor proposes set (i) as the primary definition for the secondary AUC0-inf endpoint and reports set (iii) alongside (Q11). Because AUC0-inf is not used for the equivalence decision, the choice between conventions does not change the study conclusion.</w:t>
+      </w:r>
+    </w:p>
+    <w:bookmarkEnd w:id="38"/>
+    <w:bookmarkStart w:id="39" w:name="X3361e1b2d8d7164b6e852f53c347dac92c34a46"/>
+    <w:p>
+      <w:pPr>
+        <w:pStyle w:val="Heading2"/>
+      </w:pPr>
+      <w:r>
+        <w:t xml:space="preserve">Q20. Do the conclusions hold for patients outside the study weight range?</w:t>
+      </w:r>
+    </w:p>
+    <w:p>
+      <w:pPr>
+        <w:pStyle w:val="FirstParagraph"/>
+      </w:pPr>
+      <w:r>
+        <w:rPr>
+          <w:bCs/>
+          <w:b/>
+        </w:rPr>
+        <w:t xml:space="preserve">Short answer.</w:t>
+      </w:r>
+      <w:r>
+        <w:t xml:space="preserve"> </w:t>
+      </w:r>
+      <w:r>
+        <w:t xml:space="preserve">The validity of the endpoints is judged in the population in which similarity is tested: healthy adults of 60 to 90 kg, the population most sensitive to a product difference. The case against AUC0-inf as a primary endpoint is made there (report Sections 5.2 to 5.4). That the conclusions remain when the body-weight range is widened is a robustness check reported in Appendix I; it is not part of the evidence.</w:t>
+      </w:r>
+    </w:p>
+    <w:p>
+      <w:pPr>
+        <w:pStyle w:val="BodyText"/>
+      </w:pPr>
+      <w:r>
+        <w:rPr>
+          <w:bCs/>
+          <w:b/>
+        </w:rPr>
+        <w:t xml:space="preserve">Within the trial population</w:t>
+      </w:r>
+      <w:r>
+        <w:t xml:space="preserve"> </w:t>
+      </w:r>
+      <w:r>
+        <w:t xml:space="preserve">(report Section 5.3): a reliable AUC0-inf cannot be obtained in 8.2% to 13.4% of subjects under criteria set (i) and in 33.2% to 38.8% under criteria set (iii) (two models). Failing subjects have a lower true AUC0-inf (geometric mean ratio to retained subjects 0.786 to 0.815 under set (i)), the heavier randomization stratum fails more often (by 1.5 to 2.7 percentage points), and when the products differ the share failing differs between the arms by up to 12.3 percentage points. These are the conditions under which similarity is tested.</w:t>
+      </w:r>
+    </w:p>
+    <w:p>
+      <w:pPr>
+        <w:pStyle w:val="BodyText"/>
+      </w:pPr>
+      <w:r>
+        <w:rPr>
+          <w:bCs/>
+          <w:b/>
+        </w:rPr>
+        <w:t xml:space="preserve">Robustness check</w:t>
+      </w:r>
+      <w:r>
+        <w:t xml:space="preserve"> </w:t>
+      </w:r>
+      <w:r>
+        <w:t xml:space="preserve">(report Appendix I): uniform weight bands from 40 to 150 kg, a population with a mean of 100 kg and an adult atopic dermatitis body-weight distribution (a placeholder built from published summaries) were simulated with the same models. The body-weight ranges of the models’ development data are not reported, so results above about 130 kg may be extrapolations.</w:t>
+      </w:r>
+    </w:p>
+    <w:bookmarkEnd w:id="39"/>
     <w:sectPr/>
   </w:body>
 </w:document>
@@ -2358,6 +2716,18 @@
     <w:abstractNumId w:val="991"/>
   </w:num>
   <w:num w:numId="1023">
+    <w:abstractNumId w:val="991"/>
+  </w:num>
+  <w:num w:numId="1024">
+    <w:abstractNumId w:val="991"/>
+  </w:num>
+  <w:num w:numId="1025">
+    <w:abstractNumId w:val="991"/>
+  </w:num>
+  <w:num w:numId="1026">
+    <w:abstractNumId w:val="991"/>
+  </w:num>
+  <w:num w:numId="1027">
     <w:abstractNumId w:val="991"/>
   </w:num>
 </w:numbering>

</xml_diff>

<commit_message>
README lists the results deck; regulatory package regenerated (deck trace merged as deck_ko)
Co-Authored-By: Claude Opus 5.5 <noreply@anthropic.com>
Claude-Session: https://claude.ai/code/session_01VcVRPzFxTqkW2KRC1Wkk1r
</commit_message>
<xml_diff>
--- a/regulatory/FDA_questions.docx
+++ b/regulatory/FDA_questions.docx
@@ -155,7 +155,7 @@
         <w:pStyle w:val="Date"/>
       </w:pPr>
       <w:r>
-        <w:t xml:space="preserve">2026-09-25</w:t>
+        <w:t xml:space="preserve">2026-09-29</w:t>
       </w:r>
     </w:p>
     <w:sdt>
@@ -226,7 +226,7 @@
         <w:t xml:space="preserve"> </w:t>
       </w:r>
       <w:r>
-        <w:t xml:space="preserve">8d0ebc6b88e7f378b65f3fdc6c74c8ea98708e21.</w:t>
+        <w:t xml:space="preserve">461042c5b97e261a3ef1399d4a26123bfa21afa0.</w:t>
       </w:r>
     </w:p>
     <w:p>
@@ -755,7 +755,7 @@
           <w:bCs/>
           <w:b/>
         </w:rPr>
-        <w:t xml:space="preserve">The pre-specified decision rule was not met.</w:t>
+        <w:t xml:space="preserve">The decision rule, set before any result was reported, was not met.</w:t>
       </w:r>
       <w:r>
         <w:t xml:space="preserve"> </w:t>
@@ -1395,7 +1395,7 @@
         <w:pStyle w:val="Compact"/>
       </w:pPr>
       <w:r>
-        <w:t xml:space="preserve">Varying Km from 0.01-fold to 100-fold in the test arm moves the true AUC0-inf ratio only within 0.999 to 1.059 (report Section 5.6).</w:t>
+        <w:t xml:space="preserve">Varying Km (the Michaelis-Menten constant of target-mediated elimination, through which a binding difference acts in this model) from 0.01-fold to 100-fold in the test arm moves the true AUC0-inf ratio only within 0.999 to 1.059 (report Section 5.6).</w:t>
       </w:r>
     </w:p>
     <w:p>

</xml_diff>